<commit_message>
Rewrite NEO letter and LOI attachment in the lab's prose tone
Co-Authored-By: Claude Sonnet 5.5 <noreply@anthropic.com>
Claude-Session: https://claude.ai/code/session_01ExpeRuEnfTL8Kp7aedSqLS
</commit_message>
<xml_diff>
--- a/docs/AI_Launch_LOI_Updated.docx
+++ b/docs/AI_Launch_LOI_Updated.docx
@@ -225,596 +225,75 @@
           <w:sz w:val="26"/>
           <w:szCs w:val="26"/>
         </w:rPr>
-        <w:t xml:space="preserve">Attachment A – Current Platform: Capabilities and Limitations</w:t>
-      </w:r>
-    </w:p>
-    <w:p>
-      <w:pPr>
-        <w:spacing w:after="140"/>
-      </w:pPr>
-      <w:r>
-        <w:t xml:space="preserve">Status as of late September 2026, from our own logs and test results.</w:t>
-      </w:r>
-    </w:p>
-    <w:p>
-      <w:pPr>
-        <w:spacing w:after="100" w:before="200"/>
-      </w:pPr>
-      <w:r>
-        <w:rPr>
-          <w:b/>
-          <w:bCs/>
-          <w:sz w:val="24"/>
-          <w:szCs w:val="24"/>
-        </w:rPr>
-        <w:t xml:space="preserve">What it can do today</w:t>
-      </w:r>
-    </w:p>
-    <w:tbl>
-      <w:tblPr>
-        <w:tblW w:type="dxa" w:w="9360"/>
-        <w:tblBorders>
-          <w:top w:val="single" w:color="auto" w:sz="4"/>
-          <w:left w:val="single" w:color="auto" w:sz="4"/>
-          <w:bottom w:val="single" w:color="auto" w:sz="4"/>
-          <w:right w:val="single" w:color="auto" w:sz="4"/>
-          <w:insideH w:val="single" w:color="auto" w:sz="4"/>
-          <w:insideV w:val="single" w:color="auto" w:sz="4"/>
-        </w:tblBorders>
-      </w:tblPr>
-      <w:tblGrid>
-        <w:gridCol w:w="3200"/>
-        <w:gridCol w:w="6160"/>
-      </w:tblGrid>
-      <w:tr>
-        <w:tc>
-          <w:tcPr>
-            <w:tcW w:type="dxa" w:w="3200"/>
-            <w:tcBorders>
-              <w:top w:val="single" w:color="999999" w:sz="4"/>
-              <w:left w:val="single" w:color="999999" w:sz="4"/>
-              <w:bottom w:val="single" w:color="999999" w:sz="4"/>
-              <w:right w:val="single" w:color="999999" w:sz="4"/>
-            </w:tcBorders>
-            <w:shd w:fill="D9E2F3" w:val="clear"/>
-            <w:tcMar>
-              <w:top w:type="dxa" w:w="60"/>
-              <w:left w:type="dxa" w:w="100"/>
-              <w:bottom w:type="dxa" w:w="60"/>
-              <w:right w:type="dxa" w:w="100"/>
-            </w:tcMar>
-          </w:tcPr>
-          <w:p>
-            <w:r>
-              <w:rPr>
-                <w:b/>
-                <w:bCs/>
-                <w:sz w:val="20"/>
-                <w:szCs w:val="20"/>
-              </w:rPr>
-              <w:t xml:space="preserve">Agent area</w:t>
-            </w:r>
-          </w:p>
-        </w:tc>
-        <w:tc>
-          <w:tcPr>
-            <w:tcW w:type="dxa" w:w="6160"/>
-            <w:tcBorders>
-              <w:top w:val="single" w:color="999999" w:sz="4"/>
-              <w:left w:val="single" w:color="999999" w:sz="4"/>
-              <w:bottom w:val="single" w:color="999999" w:sz="4"/>
-              <w:right w:val="single" w:color="999999" w:sz="4"/>
-            </w:tcBorders>
-            <w:shd w:fill="D9E2F3" w:val="clear"/>
-            <w:tcMar>
-              <w:top w:type="dxa" w:w="60"/>
-              <w:left w:type="dxa" w:w="100"/>
-              <w:bottom w:type="dxa" w:w="60"/>
-              <w:right w:type="dxa" w:w="100"/>
-            </w:tcMar>
-          </w:tcPr>
-          <w:p>
-            <w:r>
-              <w:rPr>
-                <w:b/>
-                <w:bCs/>
-                <w:sz w:val="20"/>
-                <w:szCs w:val="20"/>
-              </w:rPr>
-              <w:t xml:space="preserve">Current capability</w:t>
-            </w:r>
-          </w:p>
-        </w:tc>
-      </w:tr>
-      <w:tr>
-        <w:tc>
-          <w:tcPr>
-            <w:tcW w:type="dxa" w:w="3200"/>
-            <w:tcBorders>
-              <w:top w:val="single" w:color="999999" w:sz="4"/>
-              <w:left w:val="single" w:color="999999" w:sz="4"/>
-              <w:bottom w:val="single" w:color="999999" w:sz="4"/>
-              <w:right w:val="single" w:color="999999" w:sz="4"/>
-            </w:tcBorders>
-            <w:tcMar>
-              <w:top w:type="dxa" w:w="60"/>
-              <w:left w:type="dxa" w:w="100"/>
-              <w:bottom w:type="dxa" w:w="60"/>
-              <w:right w:type="dxa" w:w="100"/>
-            </w:tcMar>
-          </w:tcPr>
-          <w:p>
-            <w:r>
-              <w:rPr>
-                <w:b w:val="false"/>
-                <w:bCs w:val="false"/>
-                <w:sz w:val="20"/>
-                <w:szCs w:val="20"/>
-              </w:rPr>
-              <w:t xml:space="preserve">Statistics and pipelines (Bio-Statistician, Deep Debugger, Rapid Shell)</w:t>
-            </w:r>
-          </w:p>
-        </w:tc>
-        <w:tc>
-          <w:tcPr>
-            <w:tcW w:type="dxa" w:w="6160"/>
-            <w:tcBorders>
-              <w:top w:val="single" w:color="999999" w:sz="4"/>
-              <w:left w:val="single" w:color="999999" w:sz="4"/>
-              <w:bottom w:val="single" w:color="999999" w:sz="4"/>
-              <w:right w:val="single" w:color="999999" w:sz="4"/>
-            </w:tcBorders>
-            <w:tcMar>
-              <w:top w:type="dxa" w:w="60"/>
-              <w:left w:type="dxa" w:w="100"/>
-              <w:bottom w:type="dxa" w:w="60"/>
-              <w:right w:type="dxa" w:w="100"/>
-            </w:tcMar>
-          </w:tcPr>
-          <w:p>
-            <w:r>
-              <w:rPr>
-                <w:b w:val="false"/>
-                <w:bCs w:val="false"/>
-                <w:sz w:val="20"/>
-                <w:szCs w:val="20"/>
-              </w:rPr>
-              <w:t xml:space="preserve">Runs commands against lab files and reports counts, means, correlations, and figures. Uses vetted loaders for irregular lab spreadsheets (duplicate headers, side-by-side tables, summary rows). Applies Fisher r-to-z and Benjamini–Hochberg correction.</w:t>
-            </w:r>
-          </w:p>
-        </w:tc>
-      </w:tr>
-      <w:tr>
-        <w:tc>
-          <w:tcPr>
-            <w:tcW w:type="dxa" w:w="3200"/>
-            <w:tcBorders>
-              <w:top w:val="single" w:color="999999" w:sz="4"/>
-              <w:left w:val="single" w:color="999999" w:sz="4"/>
-              <w:bottom w:val="single" w:color="999999" w:sz="4"/>
-              <w:right w:val="single" w:color="999999" w:sz="4"/>
-            </w:tcBorders>
-            <w:tcMar>
-              <w:top w:type="dxa" w:w="60"/>
-              <w:left w:type="dxa" w:w="100"/>
-              <w:bottom w:type="dxa" w:w="60"/>
-              <w:right w:type="dxa" w:w="100"/>
-            </w:tcMar>
-          </w:tcPr>
-          <w:p>
-            <w:r>
-              <w:rPr>
-                <w:b w:val="false"/>
-                <w:bCs w:val="false"/>
-                <w:sz w:val="20"/>
-                <w:szCs w:val="20"/>
-              </w:rPr>
-              <w:t xml:space="preserve">Image analysis (Image Analyst, vision model)</w:t>
-            </w:r>
-          </w:p>
-        </w:tc>
-        <w:tc>
-          <w:tcPr>
-            <w:tcW w:type="dxa" w:w="6160"/>
-            <w:tcBorders>
-              <w:top w:val="single" w:color="999999" w:sz="4"/>
-              <w:left w:val="single" w:color="999999" w:sz="4"/>
-              <w:bottom w:val="single" w:color="999999" w:sz="4"/>
-              <w:right w:val="single" w:color="999999" w:sz="4"/>
-            </w:tcBorders>
-            <w:tcMar>
-              <w:top w:type="dxa" w:w="60"/>
-              <w:left w:type="dxa" w:w="100"/>
-              <w:bottom w:type="dxa" w:w="60"/>
-              <w:right w:type="dxa" w:w="100"/>
-            </w:tcMar>
-          </w:tcPr>
-          <w:p>
-            <w:r>
-              <w:rPr>
-                <w:b w:val="false"/>
-                <w:bCs w:val="false"/>
-                <w:sz w:val="20"/>
-                <w:szCs w:val="20"/>
-              </w:rPr>
-              <w:t xml:space="preserve">Describes lab images such as Western blots and FSCV colour plots and routes measurement tasks. Descriptive only; no validated quantification yet.</w:t>
-            </w:r>
-          </w:p>
-        </w:tc>
-      </w:tr>
-      <w:tr>
-        <w:tc>
-          <w:tcPr>
-            <w:tcW w:type="dxa" w:w="3200"/>
-            <w:tcBorders>
-              <w:top w:val="single" w:color="999999" w:sz="4"/>
-              <w:left w:val="single" w:color="999999" w:sz="4"/>
-              <w:bottom w:val="single" w:color="999999" w:sz="4"/>
-              <w:right w:val="single" w:color="999999" w:sz="4"/>
-            </w:tcBorders>
-            <w:tcMar>
-              <w:top w:type="dxa" w:w="60"/>
-              <w:left w:type="dxa" w:w="100"/>
-              <w:bottom w:type="dxa" w:w="60"/>
-              <w:right w:type="dxa" w:w="100"/>
-            </w:tcMar>
-          </w:tcPr>
-          <w:p>
-            <w:r>
-              <w:rPr>
-                <w:b w:val="false"/>
-                <w:bCs w:val="false"/>
-                <w:sz w:val="20"/>
-                <w:szCs w:val="20"/>
-              </w:rPr>
-              <w:t xml:space="preserve">Acoustics and hardware (LIFU Chronic Operations, UMSAN Model Engineer, Fixture and Transducer CAD)</w:t>
-            </w:r>
-          </w:p>
-        </w:tc>
-        <w:tc>
-          <w:tcPr>
-            <w:tcW w:type="dxa" w:w="6160"/>
-            <w:tcBorders>
-              <w:top w:val="single" w:color="999999" w:sz="4"/>
-              <w:left w:val="single" w:color="999999" w:sz="4"/>
-              <w:bottom w:val="single" w:color="999999" w:sz="4"/>
-              <w:right w:val="single" w:color="999999" w:sz="4"/>
-            </w:tcBorders>
-            <w:tcMar>
-              <w:top w:type="dxa" w:w="60"/>
-              <w:left w:type="dxa" w:w="100"/>
-              <w:bottom w:type="dxa" w:w="60"/>
-              <w:right w:type="dxa" w:w="100"/>
-            </w:tcMar>
-          </w:tcPr>
-          <w:p>
-            <w:r>
-              <w:rPr>
-                <w:b w:val="false"/>
-                <w:bCs w:val="false"/>
-                <w:sz w:val="20"/>
-                <w:szCs w:val="20"/>
-              </w:rPr>
-              <w:t xml:space="preserve">Dosimetry calculations (ISPPA, ISPTA, MI), UMSAN model code support, and 3D-printable fixture design with volume and watertightness checks.</w:t>
-            </w:r>
-          </w:p>
-        </w:tc>
-      </w:tr>
-      <w:tr>
-        <w:tc>
-          <w:tcPr>
-            <w:tcW w:type="dxa" w:w="3200"/>
-            <w:tcBorders>
-              <w:top w:val="single" w:color="999999" w:sz="4"/>
-              <w:left w:val="single" w:color="999999" w:sz="4"/>
-              <w:bottom w:val="single" w:color="999999" w:sz="4"/>
-              <w:right w:val="single" w:color="999999" w:sz="4"/>
-            </w:tcBorders>
-            <w:tcMar>
-              <w:top w:type="dxa" w:w="60"/>
-              <w:left w:type="dxa" w:w="100"/>
-              <w:bottom w:type="dxa" w:w="60"/>
-              <w:right w:type="dxa" w:w="100"/>
-            </w:tcMar>
-          </w:tcPr>
-          <w:p>
-            <w:r>
-              <w:rPr>
-                <w:b w:val="false"/>
-                <w:bCs w:val="false"/>
-                <w:sz w:val="20"/>
-                <w:szCs w:val="20"/>
-              </w:rPr>
-              <w:t xml:space="preserve">Writing and literature (Grant Writer, Senior PI Editor, Literature Synthesizer and Extractor, Clinical Diagnostics)</w:t>
-            </w:r>
-          </w:p>
-        </w:tc>
-        <w:tc>
-          <w:tcPr>
-            <w:tcW w:type="dxa" w:w="6160"/>
-            <w:tcBorders>
-              <w:top w:val="single" w:color="999999" w:sz="4"/>
-              <w:left w:val="single" w:color="999999" w:sz="4"/>
-              <w:bottom w:val="single" w:color="999999" w:sz="4"/>
-              <w:right w:val="single" w:color="999999" w:sz="4"/>
-            </w:tcBorders>
-            <w:tcMar>
-              <w:top w:type="dxa" w:w="60"/>
-              <w:left w:type="dxa" w:w="100"/>
-              <w:bottom w:type="dxa" w:w="60"/>
-              <w:right w:type="dxa" w:w="100"/>
-            </w:tcMar>
-          </w:tcPr>
-          <w:p>
-            <w:r>
-              <w:rPr>
-                <w:b w:val="false"/>
-                <w:bCs w:val="false"/>
-                <w:sz w:val="20"/>
-                <w:szCs w:val="20"/>
-              </w:rPr>
-              <w:t xml:space="preserve">Drafting, editing, and structured extraction from provided text. These agents have no terminal access.</w:t>
-            </w:r>
-          </w:p>
-        </w:tc>
-      </w:tr>
-      <w:tr>
-        <w:tc>
-          <w:tcPr>
-            <w:tcW w:type="dxa" w:w="3200"/>
-            <w:tcBorders>
-              <w:top w:val="single" w:color="999999" w:sz="4"/>
-              <w:left w:val="single" w:color="999999" w:sz="4"/>
-              <w:bottom w:val="single" w:color="999999" w:sz="4"/>
-              <w:right w:val="single" w:color="999999" w:sz="4"/>
-            </w:tcBorders>
-            <w:tcMar>
-              <w:top w:type="dxa" w:w="60"/>
-              <w:left w:type="dxa" w:w="100"/>
-              <w:bottom w:type="dxa" w:w="60"/>
-              <w:right w:type="dxa" w:w="100"/>
-            </w:tcMar>
-          </w:tcPr>
-          <w:p>
-            <w:r>
-              <w:rPr>
-                <w:b w:val="false"/>
-                <w:bCs w:val="false"/>
-                <w:sz w:val="20"/>
-                <w:szCs w:val="20"/>
-              </w:rPr>
-              <w:t xml:space="preserve">Routing between agents</w:t>
-            </w:r>
-          </w:p>
-        </w:tc>
-        <w:tc>
-          <w:tcPr>
-            <w:tcW w:type="dxa" w:w="6160"/>
-            <w:tcBorders>
-              <w:top w:val="single" w:color="999999" w:sz="4"/>
-              <w:left w:val="single" w:color="999999" w:sz="4"/>
-              <w:bottom w:val="single" w:color="999999" w:sz="4"/>
-              <w:right w:val="single" w:color="999999" w:sz="4"/>
-            </w:tcBorders>
-            <w:tcMar>
-              <w:top w:type="dxa" w:w="60"/>
-              <w:left w:type="dxa" w:w="100"/>
-              <w:bottom w:type="dxa" w:w="60"/>
-              <w:right w:type="dxa" w:w="100"/>
-            </w:tcMar>
-          </w:tcPr>
-          <w:p>
-            <w:r>
-              <w:rPr>
-                <w:b w:val="false"/>
-                <w:bCs w:val="false"/>
-                <w:sz w:val="20"/>
-                <w:szCs w:val="20"/>
-              </w:rPr>
-              <w:t xml:space="preserve">On a held-out test, 23 of 26 out-of-scope requests were routed to the right specialist and 5 of 6 in-scope requests were kept.</w:t>
-            </w:r>
-          </w:p>
-        </w:tc>
-      </w:tr>
-    </w:tbl>
-    <w:p>
-      <w:pPr>
-        <w:spacing w:after="100" w:before="200"/>
-      </w:pPr>
-      <w:r>
-        <w:rPr>
-          <w:b/>
-          <w:bCs/>
-          <w:sz w:val="24"/>
-          <w:szCs w:val="24"/>
-        </w:rPr>
-        <w:t xml:space="preserve">Safeguards built in</w:t>
-      </w:r>
-    </w:p>
-    <w:p>
-      <w:pPr>
-        <w:pStyle w:val="ListParagraph"/>
-        <w:numPr>
-          <w:ilvl w:val="0"/>
-          <w:numId w:val="2"/>
-        </w:numPr>
-        <w:spacing w:after="80"/>
-      </w:pPr>
-      <w:r>
-        <w:t xml:space="preserve">Auditable receipt for every command (process ID, exit code, output); reported numbers must trace to command output.</w:t>
-      </w:r>
-    </w:p>
-    <w:p>
-      <w:pPr>
-        <w:pStyle w:val="ListParagraph"/>
-        <w:numPr>
-          <w:ilvl w:val="0"/>
-          <w:numId w:val="2"/>
-        </w:numPr>
-        <w:spacing w:after="80"/>
-      </w:pPr>
-      <w:r>
-        <w:t xml:space="preserve">The runner flags unsourced decimals, never reports unfinished commands as results, and stops repeated or circling agents.</w:t>
-      </w:r>
-    </w:p>
-    <w:p>
-      <w:pPr>
-        <w:pStyle w:val="ListParagraph"/>
-        <w:numPr>
-          <w:ilvl w:val="0"/>
-          <w:numId w:val="2"/>
-        </w:numPr>
-        <w:spacing w:after="80"/>
-      </w:pPr>
-      <w:r>
-        <w:t xml:space="preserve">A gate forces agents to profile any lab spreadsheet with the vetted loader before reading it. The terminal is fail-closed, lab data is read-only, and web search is off on data-handling agents.</w:t>
-      </w:r>
-    </w:p>
-    <w:p>
-      <w:pPr>
-        <w:pStyle w:val="ListParagraph"/>
-        <w:numPr>
-          <w:ilvl w:val="0"/>
-          <w:numId w:val="2"/>
-        </w:numPr>
-        <w:spacing w:after="80"/>
-      </w:pPr>
-      <w:r>
-        <w:t xml:space="preserve">Known-answer test batteries compute ground truth at test time.</w:t>
-      </w:r>
-    </w:p>
-    <w:p>
-      <w:pPr>
-        <w:spacing w:after="100" w:before="200"/>
-      </w:pPr>
-      <w:r>
-        <w:rPr>
-          <w:b/>
-          <w:bCs/>
-          <w:sz w:val="24"/>
-          <w:szCs w:val="24"/>
-        </w:rPr>
-        <w:t xml:space="preserve">Limitations</w:t>
-      </w:r>
-    </w:p>
-    <w:p>
-      <w:pPr>
-        <w:pStyle w:val="ListParagraph"/>
-        <w:numPr>
-          <w:ilvl w:val="0"/>
-          <w:numId w:val="2"/>
-        </w:numPr>
-        <w:spacing w:after="80"/>
-      </w:pPr>
-      <w:r>
-        <w:rPr>
-          <w:b/>
-          <w:bCs/>
-        </w:rPr>
-        <w:t xml:space="preserve">Model size. </w:t>
-      </w:r>
-      <w:r>
-        <w:t xml:space="preserve">Large dense models are unusable on our 16 GB GPU (a 70B model ran at about 1.5 tokens per second). Our practical ceiling is roughly 20B dense or 30B mixture-of-experts models, and agents built on them struggle with multi-step tool use.</w:t>
-      </w:r>
-    </w:p>
-    <w:p>
-      <w:pPr>
-        <w:pStyle w:val="ListParagraph"/>
-        <w:numPr>
-          <w:ilvl w:val="0"/>
-          <w:numId w:val="2"/>
-        </w:numPr>
-        <w:spacing w:after="80"/>
-      </w:pPr>
-      <w:r>
-        <w:rPr>
-          <w:b/>
-          <w:bCs/>
-        </w:rPr>
-        <w:t xml:space="preserve">Reliability. </w:t>
-      </w:r>
-      <w:r>
-        <w:t xml:space="preserve">Simple tasks (a file count, a column mean) often take 8–15 turns. Logged failure modes include malformed tool calls, invented file paths, repeated commands, and stalls. Our runner catches them, but they cost time.</w:t>
-      </w:r>
-    </w:p>
-    <w:p>
-      <w:pPr>
-        <w:pStyle w:val="ListParagraph"/>
-        <w:numPr>
-          <w:ilvl w:val="0"/>
-          <w:numId w:val="2"/>
-        </w:numPr>
-        <w:spacing w:after="80"/>
-      </w:pPr>
-      <w:r>
-        <w:rPr>
-          <w:b/>
-          <w:bCs/>
-        </w:rPr>
-        <w:t xml:space="preserve">Accuracy. </w:t>
-      </w:r>
-      <w:r>
-        <w:t xml:space="preserve">Battery pass rates rose from 7/12 to 10/12 as we fixed defects. Failures in the first 36 runs were non-answers, not wrong numbers, but human verification is still required.</w:t>
-      </w:r>
-    </w:p>
-    <w:p>
-      <w:pPr>
-        <w:pStyle w:val="ListParagraph"/>
-        <w:numPr>
-          <w:ilvl w:val="0"/>
-          <w:numId w:val="2"/>
-        </w:numPr>
-        <w:spacing w:after="80"/>
-      </w:pPr>
-      <w:r>
-        <w:rPr>
-          <w:b/>
-          <w:bCs/>
-        </w:rPr>
-        <w:t xml:space="preserve">Arithmetic. </w:t>
-      </w:r>
-      <w:r>
-        <w:t xml:space="preserve">The models miscalculate unless they run code, so a command must produce every number.</w:t>
-      </w:r>
-    </w:p>
-    <w:p>
-      <w:pPr>
-        <w:pStyle w:val="ListParagraph"/>
-        <w:numPr>
-          <w:ilvl w:val="0"/>
-          <w:numId w:val="2"/>
-        </w:numPr>
-        <w:spacing w:after="80"/>
-      </w:pPr>
-      <w:r>
-        <w:rPr>
-          <w:b/>
-          <w:bCs/>
-        </w:rPr>
-        <w:t xml:space="preserve">Coverage. </w:t>
-      </w:r>
-      <w:r>
-        <w:t xml:space="preserve">Validation so far covers behavioral tables and workbooks. snRNA-seq prioritization, IHC quantification, and FUS/FSCV integration are not yet validated.</w:t>
-      </w:r>
-    </w:p>
-    <w:p>
-      <w:pPr>
-        <w:pStyle w:val="ListParagraph"/>
-        <w:numPr>
-          <w:ilvl w:val="0"/>
-          <w:numId w:val="2"/>
-        </w:numPr>
-        <w:spacing w:after="80"/>
-      </w:pPr>
-      <w:r>
-        <w:rPr>
-          <w:b/>
-          <w:bCs/>
-        </w:rPr>
-        <w:t xml:space="preserve">Scale and security. </w:t>
-      </w:r>
-      <w:r>
-        <w:t xml:space="preserve">Single-user, single-machine, with no job scheduling, shared provenance store, or multi-user access control. Two clinical/literature agents cannot call tools with current models.</w:t>
+        <w:t xml:space="preserve">Attachment A: Current Platform, Capabilities and Limitations</w:t>
+      </w:r>
+    </w:p>
+    <w:p>
+      <w:pPr>
+        <w:spacing w:after="140"/>
+      </w:pPr>
+      <w:r>
+        <w:t xml:space="preserve">This summary reflects our own logs and test results as of late September 2026.</w:t>
+      </w:r>
+    </w:p>
+    <w:p>
+      <w:pPr>
+        <w:spacing w:after="140"/>
+      </w:pPr>
+      <w:r>
+        <w:rPr>
+          <w:b/>
+          <w:bCs/>
+        </w:rPr>
+        <w:t xml:space="preserve">What the platform does today. </w:t>
+      </w:r>
+      <w:r>
+        <w:t xml:space="preserve">The 13 agents divide the work by task. The statistics and pipeline agents run commands against laboratory files and report counts, means, correlations, and figures, using vetted loaders for our irregular spreadsheets (duplicate headers, side-by-side tables, and embedded summary rows) and applying Fisher r-to-z comparisons and Benjamini-Hochberg correction. An image agent describes laboratory images, such as Western blots and FSCV color plots, but does not yet perform validated quantification. Separate agents handle acoustic dosimetry (ISPPA, ISPTA, and mechanical index), UMSAN model code, and the design of 3D-printable fixtures. Additional agents draft and edit manuscripts and extract information from provided literature; these have no access to the terminal or to laboratory files. Requests outside an agent’s scope are routed to the right specialist. In a held-out test, 23 of 26 out-of-scope requests were routed correctly and 5 of 6 in-scope requests were kept.</w:t>
+      </w:r>
+    </w:p>
+    <w:p>
+      <w:pPr>
+        <w:spacing w:after="140"/>
+      </w:pPr>
+      <w:r>
+        <w:rPr>
+          <w:b/>
+          <w:bCs/>
+        </w:rPr>
+        <w:t xml:space="preserve">Safeguards. </w:t>
+      </w:r>
+      <w:r>
+        <w:t xml:space="preserve">Every command an agent runs leaves an auditable receipt with its process identifier, exit code, and output, and reported numbers must trace to that output. The runner flags decimals that no command produced, never reports an unfinished command as a result, and stops an agent that is repeating itself. Agents must profile any laboratory spreadsheet with the vetted loader before reading it. The terminal is closed by default, laboratory data are read-only, and web search is turned off for agents that handle laboratory data.</w:t>
+      </w:r>
+    </w:p>
+    <w:p>
+      <w:pPr>
+        <w:spacing w:after="140"/>
+      </w:pPr>
+      <w:r>
+        <w:rPr>
+          <w:b/>
+          <w:bCs/>
+        </w:rPr>
+        <w:t xml:space="preserve">Limitations. </w:t>
+      </w:r>
+      <w:r>
+        <w:t xml:space="preserve">Our hardware limits us to models of roughly 20 billion parameters, or 30 billion in mixture-of-experts form; a 70-billion-parameter model ran at about 1.5 tokens per second and was unusable. Agents built on these models struggle with multi-step tool use. Simple tasks, such as counting files or computing a column mean, often take 8 to 15 turns, and we have logged malformed tool calls, invented file paths, repeated commands, and stalls. Our runner catches these, but they cost time. The models miscalculate unless they run code, so a command must produce every number. Battery pass rates rose from 7 of 12 to 10 of 12 as we fixed defects, and the failures in the first 36 runs were non-answers rather than wrong numbers, but human verification is still required.</w:t>
+      </w:r>
+    </w:p>
+    <w:p>
+      <w:pPr>
+        <w:spacing w:after="140"/>
+      </w:pPr>
+      <w:r>
+        <w:rPr>
+          <w:b/>
+          <w:bCs/>
+        </w:rPr>
+        <w:t xml:space="preserve">What is not yet established. </w:t>
+      </w:r>
+      <w:r>
+        <w:t xml:space="preserve">Validation so far covers behavioral tables and workbooks. We have not yet validated snRNA-seq prioritization, IHC quantification, or FUS/FSCV integration. The platform runs for a single user on a single machine, with no job scheduling, shared provenance store, or multi-user access control, and two of the literature and clinical agents cannot call tools with the models currently available to us. These are the gaps we would address with AI Launch support.</w:t>
       </w:r>
     </w:p>
     <w:sectPr>
@@ -1001,12 +480,6 @@
   </w:abstractNum>
   <w:num w:numId="1">
     <w:abstractNumId w:val="1"/>
-    <w:lvlOverride w:ilvl="0">
-      <w:startOverride w:val="1"/>
-    </w:lvlOverride>
-  </w:num>
-  <w:num w:numId="2">
-    <w:abstractNumId w:val="2"/>
     <w:lvlOverride w:ilvl="0">
       <w:startOverride w:val="1"/>
     </w:lvlOverride>

</xml_diff>

<commit_message>
Update letters with measured workstation, model, data-size, and battery facts
Co-Authored-By: Claude Sonnet 5.5 <noreply@anthropic.com>
Claude-Session: https://claude.ai/code/session_01ExpeRuEnfTL8Kp7aedSqLS
</commit_message>
<xml_diff>
--- a/docs/AI_Launch_LOI_Updated.docx
+++ b/docs/AI_Launch_LOI_Updated.docx
@@ -152,7 +152,7 @@
         <w:spacing w:after="140"/>
       </w:pPr>
       <w:r>
-        <w:t xml:space="preserve">Reliability has been engineered in from the start. Every command an agent runs leaves an auditable receipt, and every reported number must trace to command output. Agents must use vetted loaders for our irregular laboratory spreadsheets, unsourced numbers are flagged, and requests outside an agent’s scope are routed to the right specialist. We measure the system with known-answer test batteries whose ground truth is computed at test time. Across our first three 12-run batteries (36 runs), the agents reported no fabricated values; every failure was a non-answer, and each was traced to a specific defect and fixed. Pass rates rose from 7 of 12 to 10 of 12 as defects were fixed, and the remaining failures are under review.</w:t>
+        <w:t xml:space="preserve">Reliability has been engineered in from the start. Every command an agent runs leaves an auditable receipt, and every reported number must trace to command output. Agents must use vetted loaders for our irregular laboratory spreadsheets, unsourced numbers are flagged, and requests outside an agent’s scope are routed to the right specialist. We measure the system with known-answer test batteries whose ground truth is computed at test time. Early in development, single test runs produced two incorrect values, a padded digit and an invented mean, and these led us to add a check that flags any number no command produced. Since then, across five test batteries (51 scored runs), no agent has reported an incorrect number. Every failure was a non-answer, and each was traced to a specific defect and fixed. In the most recent 12-run battery, 10 runs passed; in the other two, an agent did not report a requested mean, and an agent declined to give a number without saying the file was missing.</w:t>
       </w:r>
     </w:p>
     <w:p>
@@ -175,7 +175,7 @@
         <w:t xml:space="preserve">Where the prototype stands today. </w:t>
       </w:r>
       <w:r>
-        <w:t xml:space="preserve">The prototype runs on a single desktop workstation (AMD Ryzen 7 9800X3D, 96 GB RAM, one 16 GB GPU, Windows 11 Home) using open-weight models served locally, with no cloud model access. Attachment A summarizes what it can and cannot do. In brief, it is a strong proof of concept for behavioral data vetting and statistics, but it is not yet a dependable platform for unattended use, and it has not yet been validated on snRNA-seq prioritization, IHC quantification, or FUS/FSCV integration.</w:t>
+        <w:t xml:space="preserve">The prototype runs on a single desktop workstation (AMD Ryzen 7 9800X3D, 96 GB RAM, one NVIDIA RTX 5070 Ti with 16 GB of memory, Windows 11 Home) using ten open-weight models served locally, with no cloud model access. It has completed 67 recorded agent runs. Attachment A summarizes what it can and cannot do. In brief, it is a strong proof of concept for behavioral data vetting and statistics, but it is not yet a dependable platform for unattended use, and it has not yet been validated on snRNA-seq prioritization, IHC quantification, or FUS/FSCV integration.</w:t>
       </w:r>
     </w:p>
     <w:p>
@@ -278,7 +278,7 @@
         <w:t xml:space="preserve">Limitations. </w:t>
       </w:r>
       <w:r>
-        <w:t xml:space="preserve">Our hardware limits us to models of roughly 20 billion parameters, or 30 billion in mixture-of-experts form; a 70-billion-parameter model ran at about 1.5 tokens per second and was unusable. Agents built on these models struggle with multi-step tool use. Simple tasks, such as counting files or computing a column mean, often take 8 to 15 turns, and we have logged malformed tool calls, invented file paths, repeated commands, and stalls. Our runner catches these, but they cost time. The models miscalculate unless they run code, so a command must produce every number. Battery pass rates rose from 7 of 12 to 10 of 12 as we fixed defects, and the failures in the first 36 runs were non-answers rather than wrong numbers, but human verification is still required.</w:t>
+        <w:t xml:space="preserve">Our hardware limits us to models of roughly 20 billion parameters, or 30 billion in mixture-of-experts form. Three of our ten models (16 to 18 GB) are larger than the GPU’s memory and must partly run on the CPU, and a 70-billion-parameter model ran at about 1.5 tokens per second and was unusable. Agents built on these models struggle with multi-step tool use. Simple tasks, such as counting files or computing a column mean, often take 8 to 15 turns, and we have logged malformed tool calls, invented file paths, repeated commands, and stalls. Our runner catches these, but they cost time. The models miscalculate unless they run code, so a command must produce every number. Battery pass rates rose from 7 of 12 to 10 of 12 as we fixed defects, and the failures were non-answers rather than wrong numbers, but human verification is still required.</w:t>
       </w:r>
     </w:p>
     <w:p>
@@ -293,7 +293,7 @@
         <w:t xml:space="preserve">What is not yet established. </w:t>
       </w:r>
       <w:r>
-        <w:t xml:space="preserve">Validation so far covers behavioral tables and workbooks. We have not yet validated snRNA-seq prioritization, IHC quantification, or FUS/FSCV integration. The platform runs for a single user on a single machine, with no job scheduling, shared provenance store, or multi-user access control, and two of the literature and clinical agents cannot call tools with the models currently available to us. These are the gaps we would address with AI Launch support.</w:t>
+        <w:t xml:space="preserve">Validation so far covers behavioral tables and workbooks. We have not yet validated snRNA-seq prioritization, IHC quantification, or FUS/FSCV integration, and the analysis environment currently has no deep-learning or single-cell libraries installed (it has Python 3.12, R 4.5, pandas, scikit-learn, and statsmodels). The platform runs for a single user on a single machine, with no job scheduling, shared provenance store, or multi-user access control, and two of the literature and clinical agents cannot call tools with the models currently available to us. These are the gaps we would address with AI Launch support.</w:t>
       </w:r>
     </w:p>
     <w:sectPr>

</xml_diff>